<commit_message>
fix: revert cart Dockerfile to correct distroless build
</commit_message>
<xml_diff>
--- a/docs/KANBAN.docx
+++ b/docs/KANBAN.docx
@@ -635,6 +635,56 @@
       </w:r>
     </w:p>
     <w:p/>
+    <w:p/>
+    <w:p>
+      <w:r>
+        <w:t>Monitoreo y test:</w:t>
+      </w:r>
+      <w:r>
+        <w:br/>
+      </w:r>
+    </w:p>
+    <w:p>
+      <w:r>
+        <w:lastRenderedPageBreak/>
+        <w:drawing>
+          <wp:inline distT="0" distB="0" distL="0" distR="0" wp14:anchorId="27065FFA" wp14:editId="63BBB6DB">
+            <wp:extent cx="5731510" cy="2209800"/>
+            <wp:effectExtent l="0" t="0" r="2540" b="0"/>
+            <wp:docPr id="21" name="Imagen 21"/>
+            <wp:cNvGraphicFramePr>
+              <a:graphicFrameLocks xmlns:a="http://schemas.openxmlformats.org/drawingml/2006/main" noChangeAspect="1"/>
+            </wp:cNvGraphicFramePr>
+            <a:graphic xmlns:a="http://schemas.openxmlformats.org/drawingml/2006/main">
+              <a:graphicData uri="http://schemas.openxmlformats.org/drawingml/2006/picture">
+                <pic:pic xmlns:pic="http://schemas.openxmlformats.org/drawingml/2006/picture">
+                  <pic:nvPicPr>
+                    <pic:cNvPr id="1" name=""/>
+                    <pic:cNvPicPr/>
+                  </pic:nvPicPr>
+                  <pic:blipFill>
+                    <a:blip r:embed="rId16"/>
+                    <a:stretch>
+                      <a:fillRect/>
+                    </a:stretch>
+                  </pic:blipFill>
+                  <pic:spPr>
+                    <a:xfrm>
+                      <a:off x="0" y="0"/>
+                      <a:ext cx="5731510" cy="2209800"/>
+                    </a:xfrm>
+                    <a:prstGeom prst="rect">
+                      <a:avLst/>
+                    </a:prstGeom>
+                  </pic:spPr>
+                </pic:pic>
+              </a:graphicData>
+            </a:graphic>
+          </wp:inline>
+        </w:drawing>
+      </w:r>
+    </w:p>
+    <w:p/>
     <w:p>
       <w:r>
         <w:t>Promoción</w:t>
@@ -667,12 +717,16 @@
       </w:r>
     </w:p>
     <w:p>
-      <w:bookmarkStart w:id="0" w:name="_GoBack"/>
-      <w:bookmarkEnd w:id="0"/>
-    </w:p>
-    <w:p>
-      <w:r>
-        <w:lastRenderedPageBreak/>
+      <w:pPr>
+        <w:rPr>
+          <w:noProof/>
+          <w:lang w:eastAsia="es-ES"/>
+        </w:rPr>
+      </w:pPr>
+    </w:p>
+    <w:p/>
+    <w:p>
+      <w:r>
         <w:drawing>
           <wp:inline distT="0" distB="0" distL="0" distR="0" wp14:anchorId="75A9002D" wp14:editId="497EDC58">
             <wp:extent cx="5731510" cy="3324225"/>
@@ -689,7 +743,7 @@
                     <pic:cNvPicPr/>
                   </pic:nvPicPr>
                   <pic:blipFill>
-                    <a:blip r:embed="rId16"/>
+                    <a:blip r:embed="rId17"/>
                     <a:stretch>
                       <a:fillRect/>
                     </a:stretch>
@@ -716,66 +770,480 @@
           <w:noProof/>
           <w:lang w:eastAsia="es-ES"/>
         </w:rPr>
-        <w:drawing>
-          <wp:inline distT="0" distB="0" distL="0" distR="0" wp14:anchorId="722EEE1F" wp14:editId="0D721B78">
-            <wp:extent cx="5731510" cy="2403475"/>
+        <w:lastRenderedPageBreak/>
+        <w:drawing>
+          <wp:inline distT="0" distB="0" distL="0" distR="0" wp14:anchorId="2BCF33F6" wp14:editId="47093597">
+            <wp:extent cx="5731510" cy="2054860"/>
+            <wp:effectExtent l="0" t="0" r="2540" b="2540"/>
+            <wp:docPr id="14" name="Imagen 14"/>
+            <wp:cNvGraphicFramePr>
+              <a:graphicFrameLocks xmlns:a="http://schemas.openxmlformats.org/drawingml/2006/main" noChangeAspect="1"/>
+            </wp:cNvGraphicFramePr>
+            <a:graphic xmlns:a="http://schemas.openxmlformats.org/drawingml/2006/main">
+              <a:graphicData uri="http://schemas.openxmlformats.org/drawingml/2006/picture">
+                <pic:pic xmlns:pic="http://schemas.openxmlformats.org/drawingml/2006/picture">
+                  <pic:nvPicPr>
+                    <pic:cNvPr id="1" name=""/>
+                    <pic:cNvPicPr/>
+                  </pic:nvPicPr>
+                  <pic:blipFill>
+                    <a:blip r:embed="rId18"/>
+                    <a:stretch>
+                      <a:fillRect/>
+                    </a:stretch>
+                  </pic:blipFill>
+                  <pic:spPr>
+                    <a:xfrm>
+                      <a:off x="0" y="0"/>
+                      <a:ext cx="5731510" cy="2054860"/>
+                    </a:xfrm>
+                    <a:prstGeom prst="rect">
+                      <a:avLst/>
+                    </a:prstGeom>
+                  </pic:spPr>
+                </pic:pic>
+              </a:graphicData>
+            </a:graphic>
+          </wp:inline>
+        </w:drawing>
+      </w:r>
+    </w:p>
+    <w:p/>
+    <w:p/>
+    <w:p>
+      <w:pPr>
+        <w:rPr>
+          <w:noProof/>
+          <w:lang w:eastAsia="es-ES"/>
+        </w:rPr>
+      </w:pPr>
+      <w:r>
+        <w:rPr>
+          <w:noProof/>
+          <w:lang w:eastAsia="es-ES"/>
+        </w:rPr>
+        <w:t xml:space="preserve">Pasaje de </w:t>
+      </w:r>
+      <w:r>
+        <w:rPr>
+          <w:noProof/>
+          <w:lang w:eastAsia="es-ES"/>
+        </w:rPr>
+        <w:t>TEST</w:t>
+      </w:r>
+      <w:r>
+        <w:rPr>
+          <w:noProof/>
+          <w:lang w:eastAsia="es-ES"/>
+        </w:rPr>
+        <w:t xml:space="preserve"> -&gt; </w:t>
+      </w:r>
+      <w:r>
+        <w:rPr>
+          <w:noProof/>
+          <w:lang w:eastAsia="es-ES"/>
+        </w:rPr>
+        <w:t>PROD</w:t>
+      </w:r>
+    </w:p>
+    <w:p>
+      <w:pPr>
+        <w:rPr>
+          <w:noProof/>
+          <w:lang w:eastAsia="es-ES"/>
+        </w:rPr>
+      </w:pPr>
+      <w:r>
+        <w:rPr>
+          <w:noProof/>
+          <w:lang w:eastAsia="es-ES"/>
+        </w:rPr>
+        <w:drawing>
+          <wp:inline distT="0" distB="0" distL="0" distR="0" wp14:anchorId="1518848F" wp14:editId="4554ED96">
+            <wp:extent cx="5731510" cy="2038350"/>
             <wp:effectExtent l="0" t="0" r="2540" b="0"/>
-            <wp:docPr id="29" name="Imagen 29"/>
-            <wp:cNvGraphicFramePr>
-              <a:graphicFrameLocks xmlns:a="http://schemas.openxmlformats.org/drawingml/2006/main" noChangeAspect="1"/>
-            </wp:cNvGraphicFramePr>
-            <a:graphic xmlns:a="http://schemas.openxmlformats.org/drawingml/2006/main">
-              <a:graphicData uri="http://schemas.openxmlformats.org/drawingml/2006/picture">
-                <pic:pic xmlns:pic="http://schemas.openxmlformats.org/drawingml/2006/picture">
-                  <pic:nvPicPr>
-                    <pic:cNvPr id="1" name=""/>
-                    <pic:cNvPicPr/>
-                  </pic:nvPicPr>
-                  <pic:blipFill>
-                    <a:blip r:embed="rId17"/>
-                    <a:stretch>
-                      <a:fillRect/>
-                    </a:stretch>
-                  </pic:blipFill>
-                  <pic:spPr>
-                    <a:xfrm>
-                      <a:off x="0" y="0"/>
-                      <a:ext cx="5731510" cy="2403475"/>
-                    </a:xfrm>
-                    <a:prstGeom prst="rect">
-                      <a:avLst/>
-                    </a:prstGeom>
-                  </pic:spPr>
-                </pic:pic>
-              </a:graphicData>
-            </a:graphic>
-          </wp:inline>
-        </w:drawing>
-      </w:r>
-    </w:p>
-    <w:p>
-      <w:r>
-        <w:rPr>
-          <w:noProof/>
-          <w:lang w:eastAsia="es-ES"/>
-        </w:rPr>
-        <w:drawing>
-          <wp:inline distT="0" distB="0" distL="0" distR="0" wp14:anchorId="643826F7" wp14:editId="593BABDE">
+            <wp:docPr id="16" name="Imagen 16"/>
+            <wp:cNvGraphicFramePr>
+              <a:graphicFrameLocks xmlns:a="http://schemas.openxmlformats.org/drawingml/2006/main" noChangeAspect="1"/>
+            </wp:cNvGraphicFramePr>
+            <a:graphic xmlns:a="http://schemas.openxmlformats.org/drawingml/2006/main">
+              <a:graphicData uri="http://schemas.openxmlformats.org/drawingml/2006/picture">
+                <pic:pic xmlns:pic="http://schemas.openxmlformats.org/drawingml/2006/picture">
+                  <pic:nvPicPr>
+                    <pic:cNvPr id="1" name=""/>
+                    <pic:cNvPicPr/>
+                  </pic:nvPicPr>
+                  <pic:blipFill>
+                    <a:blip r:embed="rId19"/>
+                    <a:stretch>
+                      <a:fillRect/>
+                    </a:stretch>
+                  </pic:blipFill>
+                  <pic:spPr>
+                    <a:xfrm>
+                      <a:off x="0" y="0"/>
+                      <a:ext cx="5731510" cy="2038350"/>
+                    </a:xfrm>
+                    <a:prstGeom prst="rect">
+                      <a:avLst/>
+                    </a:prstGeom>
+                  </pic:spPr>
+                </pic:pic>
+              </a:graphicData>
+            </a:graphic>
+          </wp:inline>
+        </w:drawing>
+      </w:r>
+    </w:p>
+    <w:p>
+      <w:pPr>
+        <w:rPr>
+          <w:noProof/>
+          <w:lang w:eastAsia="es-ES"/>
+        </w:rPr>
+      </w:pPr>
+      <w:r>
+        <w:rPr>
+          <w:noProof/>
+          <w:lang w:eastAsia="es-ES"/>
+        </w:rPr>
+        <w:drawing>
+          <wp:inline distT="0" distB="0" distL="0" distR="0" wp14:anchorId="0453F883" wp14:editId="4D402B75">
+            <wp:extent cx="5731510" cy="2221230"/>
+            <wp:effectExtent l="0" t="0" r="2540" b="7620"/>
+            <wp:docPr id="17" name="Imagen 17"/>
+            <wp:cNvGraphicFramePr>
+              <a:graphicFrameLocks xmlns:a="http://schemas.openxmlformats.org/drawingml/2006/main" noChangeAspect="1"/>
+            </wp:cNvGraphicFramePr>
+            <a:graphic xmlns:a="http://schemas.openxmlformats.org/drawingml/2006/main">
+              <a:graphicData uri="http://schemas.openxmlformats.org/drawingml/2006/picture">
+                <pic:pic xmlns:pic="http://schemas.openxmlformats.org/drawingml/2006/picture">
+                  <pic:nvPicPr>
+                    <pic:cNvPr id="1" name=""/>
+                    <pic:cNvPicPr/>
+                  </pic:nvPicPr>
+                  <pic:blipFill>
+                    <a:blip r:embed="rId20"/>
+                    <a:stretch>
+                      <a:fillRect/>
+                    </a:stretch>
+                  </pic:blipFill>
+                  <pic:spPr>
+                    <a:xfrm>
+                      <a:off x="0" y="0"/>
+                      <a:ext cx="5731510" cy="2221230"/>
+                    </a:xfrm>
+                    <a:prstGeom prst="rect">
+                      <a:avLst/>
+                    </a:prstGeom>
+                  </pic:spPr>
+                </pic:pic>
+              </a:graphicData>
+            </a:graphic>
+          </wp:inline>
+        </w:drawing>
+      </w:r>
+    </w:p>
+    <w:p>
+      <w:pPr>
+        <w:rPr>
+          <w:noProof/>
+          <w:lang w:eastAsia="es-ES"/>
+        </w:rPr>
+      </w:pPr>
+      <w:r>
+        <w:rPr>
+          <w:noProof/>
+          <w:lang w:eastAsia="es-ES"/>
+        </w:rPr>
+        <w:lastRenderedPageBreak/>
+        <w:drawing>
+          <wp:inline distT="0" distB="0" distL="0" distR="0" wp14:anchorId="4F08B630" wp14:editId="2703447F">
+            <wp:extent cx="5731510" cy="1671955"/>
+            <wp:effectExtent l="0" t="0" r="2540" b="4445"/>
+            <wp:docPr id="18" name="Imagen 18"/>
+            <wp:cNvGraphicFramePr>
+              <a:graphicFrameLocks xmlns:a="http://schemas.openxmlformats.org/drawingml/2006/main" noChangeAspect="1"/>
+            </wp:cNvGraphicFramePr>
+            <a:graphic xmlns:a="http://schemas.openxmlformats.org/drawingml/2006/main">
+              <a:graphicData uri="http://schemas.openxmlformats.org/drawingml/2006/picture">
+                <pic:pic xmlns:pic="http://schemas.openxmlformats.org/drawingml/2006/picture">
+                  <pic:nvPicPr>
+                    <pic:cNvPr id="1" name=""/>
+                    <pic:cNvPicPr/>
+                  </pic:nvPicPr>
+                  <pic:blipFill>
+                    <a:blip r:embed="rId21"/>
+                    <a:stretch>
+                      <a:fillRect/>
+                    </a:stretch>
+                  </pic:blipFill>
+                  <pic:spPr>
+                    <a:xfrm>
+                      <a:off x="0" y="0"/>
+                      <a:ext cx="5731510" cy="1671955"/>
+                    </a:xfrm>
+                    <a:prstGeom prst="rect">
+                      <a:avLst/>
+                    </a:prstGeom>
+                  </pic:spPr>
+                </pic:pic>
+              </a:graphicData>
+            </a:graphic>
+          </wp:inline>
+        </w:drawing>
+      </w:r>
+    </w:p>
+    <w:p>
+      <w:pPr>
+        <w:rPr>
+          <w:noProof/>
+          <w:lang w:eastAsia="es-ES"/>
+        </w:rPr>
+      </w:pPr>
+      <w:r>
+        <w:rPr>
+          <w:noProof/>
+          <w:lang w:eastAsia="es-ES"/>
+        </w:rPr>
+        <w:drawing>
+          <wp:inline distT="0" distB="0" distL="0" distR="0" wp14:anchorId="44B00815" wp14:editId="5B67A70B">
+            <wp:extent cx="5731510" cy="2701925"/>
+            <wp:effectExtent l="0" t="0" r="2540" b="3175"/>
+            <wp:docPr id="19" name="Imagen 19"/>
+            <wp:cNvGraphicFramePr>
+              <a:graphicFrameLocks xmlns:a="http://schemas.openxmlformats.org/drawingml/2006/main" noChangeAspect="1"/>
+            </wp:cNvGraphicFramePr>
+            <a:graphic xmlns:a="http://schemas.openxmlformats.org/drawingml/2006/main">
+              <a:graphicData uri="http://schemas.openxmlformats.org/drawingml/2006/picture">
+                <pic:pic xmlns:pic="http://schemas.openxmlformats.org/drawingml/2006/picture">
+                  <pic:nvPicPr>
+                    <pic:cNvPr id="1" name=""/>
+                    <pic:cNvPicPr/>
+                  </pic:nvPicPr>
+                  <pic:blipFill>
+                    <a:blip r:embed="rId22"/>
+                    <a:stretch>
+                      <a:fillRect/>
+                    </a:stretch>
+                  </pic:blipFill>
+                  <pic:spPr>
+                    <a:xfrm>
+                      <a:off x="0" y="0"/>
+                      <a:ext cx="5731510" cy="2701925"/>
+                    </a:xfrm>
+                    <a:prstGeom prst="rect">
+                      <a:avLst/>
+                    </a:prstGeom>
+                  </pic:spPr>
+                </pic:pic>
+              </a:graphicData>
+            </a:graphic>
+          </wp:inline>
+        </w:drawing>
+      </w:r>
+    </w:p>
+    <w:p>
+      <w:pPr>
+        <w:rPr>
+          <w:noProof/>
+          <w:lang w:eastAsia="es-ES"/>
+        </w:rPr>
+      </w:pPr>
+      <w:r>
+        <w:rPr>
+          <w:noProof/>
+          <w:lang w:eastAsia="es-ES"/>
+        </w:rPr>
+        <w:drawing>
+          <wp:inline distT="0" distB="0" distL="0" distR="0" wp14:anchorId="6D37D304" wp14:editId="452211CC">
+            <wp:extent cx="5731510" cy="1235710"/>
+            <wp:effectExtent l="0" t="0" r="2540" b="2540"/>
+            <wp:docPr id="20" name="Imagen 20"/>
+            <wp:cNvGraphicFramePr>
+              <a:graphicFrameLocks xmlns:a="http://schemas.openxmlformats.org/drawingml/2006/main" noChangeAspect="1"/>
+            </wp:cNvGraphicFramePr>
+            <a:graphic xmlns:a="http://schemas.openxmlformats.org/drawingml/2006/main">
+              <a:graphicData uri="http://schemas.openxmlformats.org/drawingml/2006/picture">
+                <pic:pic xmlns:pic="http://schemas.openxmlformats.org/drawingml/2006/picture">
+                  <pic:nvPicPr>
+                    <pic:cNvPr id="1" name=""/>
+                    <pic:cNvPicPr/>
+                  </pic:nvPicPr>
+                  <pic:blipFill>
+                    <a:blip r:embed="rId23"/>
+                    <a:stretch>
+                      <a:fillRect/>
+                    </a:stretch>
+                  </pic:blipFill>
+                  <pic:spPr>
+                    <a:xfrm>
+                      <a:off x="0" y="0"/>
+                      <a:ext cx="5731510" cy="1235710"/>
+                    </a:xfrm>
+                    <a:prstGeom prst="rect">
+                      <a:avLst/>
+                    </a:prstGeom>
+                  </pic:spPr>
+                </pic:pic>
+              </a:graphicData>
+            </a:graphic>
+          </wp:inline>
+        </w:drawing>
+      </w:r>
+    </w:p>
+    <w:p>
+      <w:pPr>
+        <w:rPr>
+          <w:noProof/>
+          <w:lang w:eastAsia="es-ES"/>
+        </w:rPr>
+      </w:pPr>
+    </w:p>
+    <w:p/>
+    <w:p/>
+    <w:p/>
+    <w:p/>
+    <w:p/>
+    <w:p/>
+    <w:p>
+      <w:r>
+        <w:br/>
+      </w:r>
+    </w:p>
+    <w:p/>
+    <w:p/>
+    <w:p/>
+    <w:p>
+      <w:r>
+        <w:t>Despliegue en DEV:</w:t>
+      </w:r>
+    </w:p>
+    <w:p/>
+    <w:p>
+      <w:r>
+        <w:drawing>
+          <wp:inline distT="0" distB="0" distL="0" distR="0" wp14:anchorId="313EA4BF" wp14:editId="24EAF3C3">
+            <wp:extent cx="5731510" cy="2894330"/>
+            <wp:effectExtent l="0" t="0" r="2540" b="1270"/>
+            <wp:docPr id="13" name="Imagen 13"/>
+            <wp:cNvGraphicFramePr>
+              <a:graphicFrameLocks xmlns:a="http://schemas.openxmlformats.org/drawingml/2006/main" noChangeAspect="1"/>
+            </wp:cNvGraphicFramePr>
+            <a:graphic xmlns:a="http://schemas.openxmlformats.org/drawingml/2006/main">
+              <a:graphicData uri="http://schemas.openxmlformats.org/drawingml/2006/picture">
+                <pic:pic xmlns:pic="http://schemas.openxmlformats.org/drawingml/2006/picture">
+                  <pic:nvPicPr>
+                    <pic:cNvPr id="1" name=""/>
+                    <pic:cNvPicPr/>
+                  </pic:nvPicPr>
+                  <pic:blipFill>
+                    <a:blip r:embed="rId24"/>
+                    <a:stretch>
+                      <a:fillRect/>
+                    </a:stretch>
+                  </pic:blipFill>
+                  <pic:spPr>
+                    <a:xfrm>
+                      <a:off x="0" y="0"/>
+                      <a:ext cx="5731510" cy="2894330"/>
+                    </a:xfrm>
+                    <a:prstGeom prst="rect">
+                      <a:avLst/>
+                    </a:prstGeom>
+                  </pic:spPr>
+                </pic:pic>
+              </a:graphicData>
+            </a:graphic>
+          </wp:inline>
+        </w:drawing>
+      </w:r>
+    </w:p>
+    <w:p/>
+    <w:p>
+      <w:r>
+        <w:t xml:space="preserve">Despliegue en </w:t>
+      </w:r>
+      <w:r>
+        <w:t>TEST</w:t>
+      </w:r>
+      <w:r>
+        <w:t>:</w:t>
+      </w:r>
+    </w:p>
+    <w:p>
+      <w:r>
+        <w:drawing>
+          <wp:inline distT="0" distB="0" distL="0" distR="0" wp14:anchorId="3FF38AB7" wp14:editId="4CEA8898">
+            <wp:extent cx="5731510" cy="2703195"/>
+            <wp:effectExtent l="0" t="0" r="2540" b="1905"/>
+            <wp:docPr id="23" name="Imagen 23"/>
+            <wp:cNvGraphicFramePr>
+              <a:graphicFrameLocks xmlns:a="http://schemas.openxmlformats.org/drawingml/2006/main" noChangeAspect="1"/>
+            </wp:cNvGraphicFramePr>
+            <a:graphic xmlns:a="http://schemas.openxmlformats.org/drawingml/2006/main">
+              <a:graphicData uri="http://schemas.openxmlformats.org/drawingml/2006/picture">
+                <pic:pic xmlns:pic="http://schemas.openxmlformats.org/drawingml/2006/picture">
+                  <pic:nvPicPr>
+                    <pic:cNvPr id="1" name=""/>
+                    <pic:cNvPicPr/>
+                  </pic:nvPicPr>
+                  <pic:blipFill>
+                    <a:blip r:embed="rId25"/>
+                    <a:stretch>
+                      <a:fillRect/>
+                    </a:stretch>
+                  </pic:blipFill>
+                  <pic:spPr>
+                    <a:xfrm>
+                      <a:off x="0" y="0"/>
+                      <a:ext cx="5731510" cy="2703195"/>
+                    </a:xfrm>
+                    <a:prstGeom prst="rect">
+                      <a:avLst/>
+                    </a:prstGeom>
+                  </pic:spPr>
+                </pic:pic>
+              </a:graphicData>
+            </a:graphic>
+          </wp:inline>
+        </w:drawing>
+      </w:r>
+    </w:p>
+    <w:p/>
+    <w:p/>
+    <w:p>
+      <w:r>
+        <w:t xml:space="preserve">Despliegue en </w:t>
+      </w:r>
+      <w:r>
+        <w:t>PROD</w:t>
+      </w:r>
+      <w:r>
+        <w:t>:</w:t>
+      </w:r>
+    </w:p>
+    <w:p/>
+    <w:p>
+      <w:r>
+        <w:lastRenderedPageBreak/>
+        <w:drawing>
+          <wp:inline distT="0" distB="0" distL="0" distR="0" wp14:anchorId="1726BE3C" wp14:editId="7FAEF8AF">
             <wp:extent cx="5731510" cy="2365375"/>
             <wp:effectExtent l="0" t="0" r="2540" b="0"/>
-            <wp:docPr id="30" name="Imagen 30"/>
-            <wp:cNvGraphicFramePr>
-              <a:graphicFrameLocks xmlns:a="http://schemas.openxmlformats.org/drawingml/2006/main" noChangeAspect="1"/>
-            </wp:cNvGraphicFramePr>
-            <a:graphic xmlns:a="http://schemas.openxmlformats.org/drawingml/2006/main">
-              <a:graphicData uri="http://schemas.openxmlformats.org/drawingml/2006/picture">
-                <pic:pic xmlns:pic="http://schemas.openxmlformats.org/drawingml/2006/picture">
-                  <pic:nvPicPr>
-                    <pic:cNvPr id="1" name=""/>
-                    <pic:cNvPicPr/>
-                  </pic:nvPicPr>
-                  <pic:blipFill>
-                    <a:blip r:embed="rId18"/>
+            <wp:docPr id="24" name="Imagen 24"/>
+            <wp:cNvGraphicFramePr>
+              <a:graphicFrameLocks xmlns:a="http://schemas.openxmlformats.org/drawingml/2006/main" noChangeAspect="1"/>
+            </wp:cNvGraphicFramePr>
+            <a:graphic xmlns:a="http://schemas.openxmlformats.org/drawingml/2006/main">
+              <a:graphicData uri="http://schemas.openxmlformats.org/drawingml/2006/picture">
+                <pic:pic xmlns:pic="http://schemas.openxmlformats.org/drawingml/2006/picture">
+                  <pic:nvPicPr>
+                    <pic:cNvPr id="1" name=""/>
+                    <pic:cNvPicPr/>
+                  </pic:nvPicPr>
+                  <pic:blipFill>
+                    <a:blip r:embed="rId26"/>
                     <a:stretch>
                       <a:fillRect/>
                     </a:stretch>
@@ -795,183 +1263,50 @@
           </wp:inline>
         </w:drawing>
       </w:r>
-    </w:p>
-    <w:p>
-      <w:r>
-        <w:rPr>
-          <w:noProof/>
-          <w:lang w:eastAsia="es-ES"/>
-        </w:rPr>
-        <w:lastRenderedPageBreak/>
-        <w:drawing>
-          <wp:inline distT="0" distB="0" distL="0" distR="0" wp14:anchorId="00E8E644" wp14:editId="01D67C60">
-            <wp:extent cx="5731510" cy="1282065"/>
+      <w:bookmarkStart w:id="0" w:name="_GoBack"/>
+      <w:bookmarkEnd w:id="0"/>
+    </w:p>
+    <w:p/>
+    <w:p>
+      <w:r>
+        <w:drawing>
+          <wp:inline distT="0" distB="0" distL="0" distR="0" wp14:anchorId="6D69FB2E" wp14:editId="2DF78B8A">
+            <wp:extent cx="5731510" cy="2409190"/>
             <wp:effectExtent l="0" t="0" r="2540" b="0"/>
-            <wp:docPr id="31" name="Imagen 31"/>
-            <wp:cNvGraphicFramePr>
-              <a:graphicFrameLocks xmlns:a="http://schemas.openxmlformats.org/drawingml/2006/main" noChangeAspect="1"/>
-            </wp:cNvGraphicFramePr>
-            <a:graphic xmlns:a="http://schemas.openxmlformats.org/drawingml/2006/main">
-              <a:graphicData uri="http://schemas.openxmlformats.org/drawingml/2006/picture">
-                <pic:pic xmlns:pic="http://schemas.openxmlformats.org/drawingml/2006/picture">
-                  <pic:nvPicPr>
-                    <pic:cNvPr id="1" name=""/>
-                    <pic:cNvPicPr/>
-                  </pic:nvPicPr>
-                  <pic:blipFill>
-                    <a:blip r:embed="rId19"/>
-                    <a:stretch>
-                      <a:fillRect/>
-                    </a:stretch>
-                  </pic:blipFill>
-                  <pic:spPr>
-                    <a:xfrm>
-                      <a:off x="0" y="0"/>
-                      <a:ext cx="5731510" cy="1282065"/>
-                    </a:xfrm>
-                    <a:prstGeom prst="rect">
-                      <a:avLst/>
-                    </a:prstGeom>
-                  </pic:spPr>
-                </pic:pic>
-              </a:graphicData>
-            </a:graphic>
-          </wp:inline>
-        </w:drawing>
-      </w:r>
-      <w:r>
-        <w:br/>
-      </w:r>
-      <w:r>
-        <w:rPr>
-          <w:noProof/>
-          <w:lang w:eastAsia="es-ES"/>
-        </w:rPr>
-        <w:drawing>
-          <wp:inline distT="0" distB="0" distL="0" distR="0" wp14:anchorId="6EBF2738" wp14:editId="36507865">
-            <wp:extent cx="5731510" cy="2112645"/>
-            <wp:effectExtent l="0" t="0" r="2540" b="1905"/>
-            <wp:docPr id="32" name="Imagen 32"/>
-            <wp:cNvGraphicFramePr>
-              <a:graphicFrameLocks xmlns:a="http://schemas.openxmlformats.org/drawingml/2006/main" noChangeAspect="1"/>
-            </wp:cNvGraphicFramePr>
-            <a:graphic xmlns:a="http://schemas.openxmlformats.org/drawingml/2006/main">
-              <a:graphicData uri="http://schemas.openxmlformats.org/drawingml/2006/picture">
-                <pic:pic xmlns:pic="http://schemas.openxmlformats.org/drawingml/2006/picture">
-                  <pic:nvPicPr>
-                    <pic:cNvPr id="1" name=""/>
-                    <pic:cNvPicPr/>
-                  </pic:nvPicPr>
-                  <pic:blipFill>
-                    <a:blip r:embed="rId20"/>
-                    <a:stretch>
-                      <a:fillRect/>
-                    </a:stretch>
-                  </pic:blipFill>
-                  <pic:spPr>
-                    <a:xfrm>
-                      <a:off x="0" y="0"/>
-                      <a:ext cx="5731510" cy="2112645"/>
-                    </a:xfrm>
-                    <a:prstGeom prst="rect">
-                      <a:avLst/>
-                    </a:prstGeom>
-                  </pic:spPr>
-                </pic:pic>
-              </a:graphicData>
-            </a:graphic>
-          </wp:inline>
-        </w:drawing>
-      </w:r>
-    </w:p>
-    <w:p/>
-    <w:p>
-      <w:r>
-        <w:rPr>
-          <w:noProof/>
-          <w:lang w:eastAsia="es-ES"/>
-        </w:rPr>
-        <w:drawing>
-          <wp:inline distT="0" distB="0" distL="0" distR="0" wp14:anchorId="17B96E77" wp14:editId="3FCF7F62">
-            <wp:extent cx="5731510" cy="3242945"/>
-            <wp:effectExtent l="0" t="0" r="2540" b="0"/>
-            <wp:docPr id="33" name="Imagen 33"/>
-            <wp:cNvGraphicFramePr>
-              <a:graphicFrameLocks xmlns:a="http://schemas.openxmlformats.org/drawingml/2006/main" noChangeAspect="1"/>
-            </wp:cNvGraphicFramePr>
-            <a:graphic xmlns:a="http://schemas.openxmlformats.org/drawingml/2006/main">
-              <a:graphicData uri="http://schemas.openxmlformats.org/drawingml/2006/picture">
-                <pic:pic xmlns:pic="http://schemas.openxmlformats.org/drawingml/2006/picture">
-                  <pic:nvPicPr>
-                    <pic:cNvPr id="1" name=""/>
-                    <pic:cNvPicPr/>
-                  </pic:nvPicPr>
-                  <pic:blipFill>
-                    <a:blip r:embed="rId21"/>
-                    <a:stretch>
-                      <a:fillRect/>
-                    </a:stretch>
-                  </pic:blipFill>
-                  <pic:spPr>
-                    <a:xfrm>
-                      <a:off x="0" y="0"/>
-                      <a:ext cx="5731510" cy="3242945"/>
-                    </a:xfrm>
-                    <a:prstGeom prst="rect">
-                      <a:avLst/>
-                    </a:prstGeom>
-                  </pic:spPr>
-                </pic:pic>
-              </a:graphicData>
-            </a:graphic>
-          </wp:inline>
-        </w:drawing>
-      </w:r>
-    </w:p>
-    <w:p>
-      <w:r>
-        <w:rPr>
-          <w:noProof/>
-          <w:lang w:eastAsia="es-ES"/>
-        </w:rPr>
-        <w:lastRenderedPageBreak/>
-        <w:drawing>
-          <wp:inline distT="0" distB="0" distL="0" distR="0" wp14:anchorId="3915EEF6" wp14:editId="197D25CA">
-            <wp:extent cx="5731510" cy="2571750"/>
-            <wp:effectExtent l="0" t="0" r="2540" b="0"/>
-            <wp:docPr id="34" name="Imagen 34"/>
-            <wp:cNvGraphicFramePr>
-              <a:graphicFrameLocks xmlns:a="http://schemas.openxmlformats.org/drawingml/2006/main" noChangeAspect="1"/>
-            </wp:cNvGraphicFramePr>
-            <a:graphic xmlns:a="http://schemas.openxmlformats.org/drawingml/2006/main">
-              <a:graphicData uri="http://schemas.openxmlformats.org/drawingml/2006/picture">
-                <pic:pic xmlns:pic="http://schemas.openxmlformats.org/drawingml/2006/picture">
-                  <pic:nvPicPr>
-                    <pic:cNvPr id="1" name=""/>
-                    <pic:cNvPicPr/>
-                  </pic:nvPicPr>
-                  <pic:blipFill>
-                    <a:blip r:embed="rId22"/>
-                    <a:stretch>
-                      <a:fillRect/>
-                    </a:stretch>
-                  </pic:blipFill>
-                  <pic:spPr>
-                    <a:xfrm>
-                      <a:off x="0" y="0"/>
-                      <a:ext cx="5731510" cy="2571750"/>
-                    </a:xfrm>
-                    <a:prstGeom prst="rect">
-                      <a:avLst/>
-                    </a:prstGeom>
-                  </pic:spPr>
-                </pic:pic>
-              </a:graphicData>
-            </a:graphic>
-          </wp:inline>
-        </w:drawing>
-      </w:r>
-    </w:p>
+            <wp:docPr id="22" name="Imagen 22"/>
+            <wp:cNvGraphicFramePr>
+              <a:graphicFrameLocks xmlns:a="http://schemas.openxmlformats.org/drawingml/2006/main" noChangeAspect="1"/>
+            </wp:cNvGraphicFramePr>
+            <a:graphic xmlns:a="http://schemas.openxmlformats.org/drawingml/2006/main">
+              <a:graphicData uri="http://schemas.openxmlformats.org/drawingml/2006/picture">
+                <pic:pic xmlns:pic="http://schemas.openxmlformats.org/drawingml/2006/picture">
+                  <pic:nvPicPr>
+                    <pic:cNvPr id="1" name=""/>
+                    <pic:cNvPicPr/>
+                  </pic:nvPicPr>
+                  <pic:blipFill>
+                    <a:blip r:embed="rId27"/>
+                    <a:stretch>
+                      <a:fillRect/>
+                    </a:stretch>
+                  </pic:blipFill>
+                  <pic:spPr>
+                    <a:xfrm>
+                      <a:off x="0" y="0"/>
+                      <a:ext cx="5731510" cy="2409190"/>
+                    </a:xfrm>
+                    <a:prstGeom prst="rect">
+                      <a:avLst/>
+                    </a:prstGeom>
+                  </pic:spPr>
+                </pic:pic>
+              </a:graphicData>
+            </a:graphic>
+          </wp:inline>
+        </w:drawing>
+      </w:r>
+    </w:p>
+    <w:p/>
     <w:sectPr>
       <w:pgSz w:w="11906" w:h="16838"/>
       <w:pgMar w:top="1440" w:right="1440" w:bottom="1440" w:left="1440" w:header="708" w:footer="708" w:gutter="0"/>
@@ -1375,7 +1710,7 @@
   <w:style w:type="paragraph" w:default="1" w:styleId="Normal">
     <w:name w:val="Normal"/>
     <w:qFormat/>
-    <w:rsid w:val="003E71F3"/>
+    <w:rsid w:val="001107DA"/>
   </w:style>
   <w:style w:type="character" w:default="1" w:styleId="Fuentedeprrafopredeter">
     <w:name w:val="Default Paragraph Font"/>

</xml_diff>